<commit_message>
updating AR VIVAN and SNS GLOBLE Annexture Document
</commit_message>
<xml_diff>
--- a/templates/AR/BAHRAIN/Annexure.docx
+++ b/templates/AR/BAHRAIN/Annexure.docx
@@ -48,15 +48,7 @@
         <w:t>14-02-2026</w:t>
       </w:r>
       <w:r>
-        <w:t xml:space="preserve"> by and between the following parties for the purpose of recruitment of Indian workers and processing of Emigration Clearance through the </w:t>
-      </w:r>
-      <w:proofErr w:type="spellStart"/>
-      <w:r>
-        <w:t>eMigrate</w:t>
-      </w:r>
-      <w:proofErr w:type="spellEnd"/>
-      <w:r>
-        <w:t xml:space="preserve"> system in accordance with the provisions of the Emigration Act, 1983 and instructions issued by the Ministry of External Affairs, Government of India.</w:t>
+        <w:t xml:space="preserve"> by and between the following parties for the purpose of recruitment of Indian workers and processing of Emigration Clearance through the eMigrate system in accordance with the provisions of the Emigration Act, 1983 and instructions issued by the Ministry of External Affairs, Government of India.</w:t>
       </w:r>
     </w:p>
     <w:p>
@@ -110,31 +102,11 @@
       </w:r>
     </w:p>
     <w:p>
-      <w:r>
-        <w:t xml:space="preserve">Legal Status (Company / Establishment / Individual): </w:t>
-      </w:r>
-      <w:r>
-        <w:rPr>
-          <w:b/>
-          <w:color w:val="000000" w:themeColor="text1"/>
-        </w:rPr>
-        <w:t>{{LEGAL_STATUS}}</w:t>
-      </w:r>
-    </w:p>
-    <w:p>
       <w:pPr>
         <w:ind w:right="-1566"/>
       </w:pPr>
       <w:r>
-        <w:t xml:space="preserve">Business / Commercial Registration / Trade </w:t>
-      </w:r>
-      <w:proofErr w:type="spellStart"/>
-      <w:r>
-        <w:t>Licence</w:t>
-      </w:r>
-      <w:proofErr w:type="spellEnd"/>
-      <w:r>
-        <w:t xml:space="preserve"> No/ </w:t>
+        <w:t xml:space="preserve">Business / Commercial Registration / Trade Licence No/ </w:t>
       </w:r>
       <w:r>
         <w:t>P</w:t>
@@ -206,59 +178,6 @@
           <w:color w:val="000000" w:themeColor="text1"/>
         </w:rPr>
         <w:t>{{SPADD}}</w:t>
-      </w:r>
-    </w:p>
-    <w:p>
-      <w:pPr>
-        <w:ind w:right="-1566"/>
-        <w:rPr>
-          <w:b/>
-          <w:color w:val="FF0000"/>
-        </w:rPr>
-      </w:pPr>
-      <w:proofErr w:type="spellStart"/>
-      <w:r>
-        <w:t>Authorised</w:t>
-      </w:r>
-      <w:proofErr w:type="spellEnd"/>
-      <w:r>
-        <w:t xml:space="preserve"> Signatory (Name &amp; Designation): </w:t>
-      </w:r>
-      <w:r>
-        <w:rPr>
-          <w:b/>
-          <w:color w:val="000000" w:themeColor="text1"/>
-        </w:rPr>
-        <w:t>{{AUTHORISED_SIGNATORY}}</w:t>
-      </w:r>
-      <w:r>
-        <w:rPr>
-          <w:b/>
-          <w:color w:val="FF0000"/>
-        </w:rPr>
-        <w:t xml:space="preserve"> </w:t>
-      </w:r>
-    </w:p>
-    <w:p>
-      <w:pPr>
-        <w:ind w:right="-1566"/>
-      </w:pPr>
-      <w:r>
-        <w:t xml:space="preserve">Passport / ID No. of Authorized Signatory: </w:t>
-      </w:r>
-      <w:r>
-        <w:rPr>
-          <w:b/>
-          <w:color w:val="000000" w:themeColor="text1"/>
-        </w:rPr>
-        <w:t>{{ID_NO}}</w:t>
-      </w:r>
-      <w:r>
-        <w:rPr>
-          <w:b/>
-          <w:color w:val="FF0000"/>
-        </w:rPr>
-        <w:t xml:space="preserve"> </w:t>
       </w:r>
     </w:p>
     <w:p>
@@ -350,21 +269,7 @@
         <w:rPr>
           <w:b/>
         </w:rPr>
-        <w:t xml:space="preserve">G-24, Thapar </w:t>
-      </w:r>
-      <w:proofErr w:type="spellStart"/>
-      <w:r>
-        <w:rPr>
-          <w:b/>
-        </w:rPr>
-        <w:t>Chembers</w:t>
-      </w:r>
-      <w:proofErr w:type="spellEnd"/>
-      <w:r>
-        <w:rPr>
-          <w:b/>
-        </w:rPr>
-        <w:t>-II Opp. Kalindi Colony Ring Road New Delhi 110014</w:t>
+        <w:t>G-24, Thapar Chembers-II Opp. Kalindi Colony Ring Road New Delhi 110014</w:t>
       </w:r>
       <w:r>
         <w:rPr>
@@ -382,13 +287,8 @@
       </w:pPr>
     </w:p>
     <w:p>
-      <w:proofErr w:type="spellStart"/>
       <w:r>
-        <w:t>Authorised</w:t>
-      </w:r>
-      <w:proofErr w:type="spellEnd"/>
-      <w:r>
-        <w:t xml:space="preserve"> Signatory (Name &amp; Designation): </w:t>
+        <w:t xml:space="preserve">Authorised Signatory (Name &amp; Designation): </w:t>
       </w:r>
       <w:r>
         <w:rPr>
@@ -416,15 +316,7 @@
     </w:p>
     <w:p>
       <w:r>
-        <w:t xml:space="preserve">1. To </w:t>
-      </w:r>
-      <w:proofErr w:type="spellStart"/>
-      <w:r>
-        <w:t>authorise</w:t>
-      </w:r>
-      <w:proofErr w:type="spellEnd"/>
-      <w:r>
-        <w:t xml:space="preserve"> the Recruiting Agent to recruit Indian workers on behalf of the Foreign Employer;</w:t>
+        <w:t>1. To authorise the Recruiting Agent to recruit Indian workers on behalf of the Foreign Employer;</w:t>
       </w:r>
     </w:p>
     <w:p>
@@ -434,16 +326,7 @@
     </w:p>
     <w:p>
       <w:r>
-        <w:lastRenderedPageBreak/>
-        <w:t xml:space="preserve">3. To jointly undertake compliance with the provisions of the Emigration Act, 1983 and instructions issued by the Government of India for processing Emigration Clearance through the </w:t>
-      </w:r>
-      <w:proofErr w:type="spellStart"/>
-      <w:r>
-        <w:t>eMigrate</w:t>
-      </w:r>
-      <w:proofErr w:type="spellEnd"/>
-      <w:r>
-        <w:t xml:space="preserve"> system.</w:t>
+        <w:t>3. To jointly undertake compliance with the provisions of the Emigration Act, 1983 and instructions issued by the Government of India for processing Emigration Clearance through the eMigrate system.</w:t>
       </w:r>
     </w:p>
     <w:p>
@@ -451,44 +334,13 @@
         <w:pStyle w:val="Heading2"/>
       </w:pPr>
       <w:r>
-        <w:t xml:space="preserve">4. </w:t>
-      </w:r>
-      <w:proofErr w:type="spellStart"/>
-      <w:r>
-        <w:t>Authorisation</w:t>
-      </w:r>
-      <w:proofErr w:type="spellEnd"/>
-      <w:r>
-        <w:t xml:space="preserve"> by Foreign Employer</w:t>
+        <w:lastRenderedPageBreak/>
+        <w:t>4. Authorisation by Foreign Employer</w:t>
       </w:r>
     </w:p>
     <w:p>
       <w:r>
-        <w:t xml:space="preserve">The Foreign Employer hereby </w:t>
-      </w:r>
-      <w:proofErr w:type="spellStart"/>
-      <w:r>
-        <w:t>authorises</w:t>
-      </w:r>
-      <w:proofErr w:type="spellEnd"/>
-      <w:r>
-        <w:t xml:space="preserve"> and appoints the Recruiting Agent as its lawful representative for recruiting Indian workers, processing Emigration Clearance applications, representing before the Protector of Emigrants and uploading employment contracts on the </w:t>
-      </w:r>
-      <w:proofErr w:type="spellStart"/>
-      <w:r>
-        <w:t>eMigrate</w:t>
-      </w:r>
-      <w:proofErr w:type="spellEnd"/>
-      <w:r>
-        <w:t xml:space="preserve"> system. This </w:t>
-      </w:r>
-      <w:proofErr w:type="spellStart"/>
-      <w:r>
-        <w:t>authorisation</w:t>
-      </w:r>
-      <w:proofErr w:type="spellEnd"/>
-      <w:r>
-        <w:t xml:space="preserve"> shall be demand-specific and non-transferable.</w:t>
+        <w:t>The Foreign Employer hereby authorises and appoints the Recruiting Agent as its lawful representative for recruiting Indian workers, processing Emigration Clearance applications, representing before the Protector of Emigrants and uploading employment contracts on the eMigrate system. This authorisation shall be demand-specific and non-transferable.</w:t>
       </w:r>
     </w:p>
     <w:p>
@@ -699,13 +551,8 @@
               <w:jc w:val="center"/>
             </w:pPr>
             <w:r>
-              <w:t xml:space="preserve">2 </w:t>
+              <w:t>2 YEAR</w:t>
             </w:r>
-            <w:proofErr w:type="gramStart"/>
-            <w:r>
-              <w:t>YEAR</w:t>
-            </w:r>
-            <w:proofErr w:type="gramEnd"/>
           </w:p>
         </w:tc>
         <w:tc>
@@ -771,15 +618,7 @@
     </w:p>
     <w:p>
       <w:r>
-        <w:t xml:space="preserve">Medical facilities and/or medical insurance coverage as per host country </w:t>
-      </w:r>
-      <w:proofErr w:type="spellStart"/>
-      <w:r>
-        <w:t>labour</w:t>
-      </w:r>
-      <w:proofErr w:type="spellEnd"/>
-      <w:r>
-        <w:t xml:space="preserve"> laws;</w:t>
+        <w:t>Medical facilities and/or medical insurance coverage as per host country labour laws;</w:t>
       </w:r>
     </w:p>
     <w:p>
@@ -797,7 +636,6 @@
         <w:pStyle w:val="Heading2"/>
       </w:pPr>
       <w:r>
-        <w:lastRenderedPageBreak/>
         <w:t>7. Declarations and Undertakings</w:t>
       </w:r>
     </w:p>
@@ -811,6 +649,7 @@
         <w:pStyle w:val="Heading2"/>
       </w:pPr>
       <w:r>
+        <w:lastRenderedPageBreak/>
         <w:t>8. Signatures</w:t>
       </w:r>
     </w:p>
@@ -945,14 +784,12 @@
                       <w:lang w:val="en-IN"/>
                     </w:rPr>
                   </w:pPr>
-                  <w:proofErr w:type="spellStart"/>
                   <w:r>
                     <w:rPr>
                       <w:lang w:val="en-IN"/>
                     </w:rPr>
                     <w:t>BoarderBoX</w:t>
                   </w:r>
-                  <w:proofErr w:type="spellEnd"/>
                 </w:p>
               </w:txbxContent>
             </v:textbox>
@@ -1022,15 +859,7 @@
     </w:p>
     <w:p>
       <w:r>
-        <w:t xml:space="preserve">Date &amp; Place: </w:t>
-      </w:r>
-      <w:proofErr w:type="gramStart"/>
-      <w:r>
-        <w:t>New  Delhi</w:t>
-      </w:r>
-      <w:proofErr w:type="gramEnd"/>
-      <w:r>
-        <w:t xml:space="preserve"> </w:t>
+        <w:t xml:space="preserve">Date &amp; Place: New  Delhi </w:t>
       </w:r>
     </w:p>
     <w:p>

</xml_diff>